<commit_message>
chore(templates): update Medical GL template
</commit_message>
<xml_diff>
--- a/templates/Medical Case Study and GL/Medical GL.fixed.docx
+++ b/templates/Medical Case Study and GL/Medical GL.fixed.docx
@@ -1,6 +1,6 @@
 
 <file path=word/document.xml><?xml version="1.0" encoding="utf-8"?>
-<w:document xmlns:wpc="http://schemas.microsoft.com/office/word/2010/wordprocessingCanvas" xmlns:cx="http://schemas.microsoft.com/office/drawing/2014/chartex" xmlns:cx1="http://schemas.microsoft.com/office/drawing/2015/9/8/chartex" xmlns:cx2="http://schemas.microsoft.com/office/drawing/2015/10/21/chartex" xmlns:cx3="http://schemas.microsoft.com/office/drawing/2016/5/9/chartex" xmlns:cx4="http://schemas.microsoft.com/office/drawing/2016/5/10/chartex" xmlns:cx5="http://schemas.microsoft.com/office/drawing/2016/5/11/chartex" xmlns:cx6="http://schemas.microsoft.com/office/drawing/2016/5/12/chartex" xmlns:cx7="http://schemas.microsoft.com/office/drawing/2016/5/13/chartex" xmlns:cx8="http://schemas.microsoft.com/office/drawing/2016/5/14/chartex" xmlns:mc="http://schemas.openxmlformats.org/markup-compatibility/2006" xmlns:aink="http://schemas.microsoft.com/office/drawing/2016/ink" xmlns:am3d="http://schemas.microsoft.com/office/drawing/2017/model3d" xmlns:o="urn:schemas-microsoft-com:office:office" xmlns:oel="http://schemas.microsoft.com/office/2019/extlst" xmlns:r="http://schemas.openxmlformats.org/officeDocument/2006/relationships" xmlns:m="http://schemas.openxmlformats.org/officeDocument/2006/math" xmlns:v="urn:schemas-microsoft-com:vml" xmlns:wp14="http://schemas.microsoft.com/office/word/2010/wordprocessingDrawing" xmlns:wp="http://schemas.openxmlformats.org/drawingml/2006/wordprocessingDrawing" xmlns:w10="urn:schemas-microsoft-com:office:word" xmlns:w="http://schemas.openxmlformats.org/wordprocessingml/2006/main" xmlns:w14="http://schemas.microsoft.com/office/word/2010/wordml" xmlns:w15="http://schemas.microsoft.com/office/word/2012/wordml" xmlns:w16cex="http://schemas.microsoft.com/office/word/2018/wordml/cex" xmlns:w16cid="http://schemas.microsoft.com/office/word/2016/wordml/cid" xmlns:w16="http://schemas.microsoft.com/office/word/2018/wordml" xmlns:w16du="http://schemas.microsoft.com/office/word/2023/wordml/word16du" xmlns:w16sdtdh="http://schemas.microsoft.com/office/word/2020/wordml/sdtdatahash" xmlns:w16sdtfl="http://schemas.microsoft.com/office/word/2024/wordml/sdtformatlock" xmlns:w16se="http://schemas.microsoft.com/office/word/2015/wordml/symex" xmlns:wpg="http://schemas.microsoft.com/office/word/2010/wordprocessingGroup" xmlns:wpi="http://schemas.microsoft.com/office/word/2010/wordprocessingInk" xmlns:wne="http://schemas.microsoft.com/office/word/2006/wordml" xmlns:wps="http://schemas.microsoft.com/office/word/2010/wordprocessingShape" mc:Ignorable="w14 w15 w16se w16cid w16 w16cex w16sdtdh w16sdtfl w16du wp14">
+<w:document xmlns:wpc="http://schemas.microsoft.com/office/word/2010/wordprocessingCanvas" xmlns:cx="http://schemas.microsoft.com/office/drawing/2014/chartex" xmlns:cx1="http://schemas.microsoft.com/office/drawing/2015/9/8/chartex" xmlns:cx2="http://schemas.microsoft.com/office/drawing/2015/10/21/chartex" xmlns:cx3="http://schemas.microsoft.com/office/drawing/2016/5/9/chartex" xmlns:cx4="http://schemas.microsoft.com/office/drawing/2016/5/10/chartex" xmlns:cx5="http://schemas.microsoft.com/office/drawing/2016/5/11/chartex" xmlns:cx6="http://schemas.microsoft.com/office/drawing/2016/5/12/chartex" xmlns:cx7="http://schemas.microsoft.com/office/drawing/2016/5/13/chartex" xmlns:cx8="http://schemas.microsoft.com/office/drawing/2016/5/14/chartex" xmlns:mc="http://schemas.openxmlformats.org/markup-compatibility/2006" xmlns:aink="http://schemas.microsoft.com/office/drawing/2016/ink" xmlns:am3d="http://schemas.microsoft.com/office/drawing/2017/model3d" xmlns:o="urn:schemas-microsoft-com:office:office" xmlns:oel="http://schemas.microsoft.com/office/2019/extlst" xmlns:r="http://schemas.openxmlformats.org/officeDocument/2006/relationships" xmlns:m="http://schemas.openxmlformats.org/officeDocument/2006/math" xmlns:v="urn:schemas-microsoft-com:vml" xmlns:wp14="http://schemas.microsoft.com/office/word/2010/wordprocessingDrawing" xmlns:wp="http://schemas.openxmlformats.org/drawingml/2006/wordprocessingDrawing" xmlns:w10="urn:schemas-microsoft-com:office:word" xmlns:w="http://schemas.openxmlformats.org/wordprocessingml/2006/main" xmlns:w14="http://schemas.microsoft.com/office/word/2010/wordml" xmlns:w15="http://schemas.microsoft.com/office/word/2012/wordml" xmlns:w16cei="http://schemas.microsoft.com/office/word/2026/wordml/cei" xmlns:w16cex="http://schemas.microsoft.com/office/word/2018/wordml/cex" xmlns:w16cid="http://schemas.microsoft.com/office/word/2016/wordml/cid" xmlns:w16="http://schemas.microsoft.com/office/word/2018/wordml" xmlns:w16du="http://schemas.microsoft.com/office/word/2023/wordml/word16du" xmlns:w16sdtdh="http://schemas.microsoft.com/office/word/2020/wordml/sdtdatahash" xmlns:w16sdtfl="http://schemas.microsoft.com/office/word/2024/wordml/sdtformatlock" xmlns:w16se="http://schemas.microsoft.com/office/word/2015/wordml/symex" xmlns:wpg="http://schemas.microsoft.com/office/word/2010/wordprocessingGroup" xmlns:wpi="http://schemas.microsoft.com/office/word/2010/wordprocessingInk" xmlns:wne="http://schemas.microsoft.com/office/word/2006/wordml" xmlns:wps="http://schemas.microsoft.com/office/word/2010/wordprocessingShape" mc:Ignorable="w14 w15 w16se w16cid w16 w16cex w16sdtdh w16sdtfl w16du wp14">
   <w:body>
     <w:p>
       <w:pPr>
@@ -1048,10 +1048,90 @@
           <w:u w:val="single"/>
         </w:rPr>
       </w:pPr>
+      <w:r>
+        <w:rPr>
+          <w:rFonts w:ascii="Arial" w:hAnsi="Arial" w:cs="Arial"/>
+          <w:b/>
+          <w:noProof/>
+          <w:u w:val="single"/>
+          <w14:ligatures w14:val="standardContextual"/>
+        </w:rPr>
+        <mc:AlternateContent>
+          <mc:Choice Requires="wps">
+            <w:drawing>
+              <wp:anchor distT="0" distB="0" distL="114300" distR="114300" simplePos="0" relativeHeight="251660288" behindDoc="0" locked="0" layoutInCell="1" allowOverlap="1" wp14:anchorId="29928725" wp14:editId="3F05EC74">
+                <wp:simplePos x="0" y="0"/>
+                <wp:positionH relativeFrom="column">
+                  <wp:posOffset>3930091</wp:posOffset>
+                </wp:positionH>
+                <wp:positionV relativeFrom="paragraph">
+                  <wp:posOffset>152856</wp:posOffset>
+                </wp:positionV>
+                <wp:extent cx="1945843" cy="0"/>
+                <wp:effectExtent l="0" t="0" r="0" b="0"/>
+                <wp:wrapNone/>
+                <wp:docPr id="626168029" name="Straight Connector 3"/>
+                <wp:cNvGraphicFramePr/>
+                <a:graphic xmlns:a="http://schemas.openxmlformats.org/drawingml/2006/main">
+                  <a:graphicData uri="http://schemas.microsoft.com/office/word/2010/wordprocessingShape">
+                    <wps:wsp>
+                      <wps:cNvCnPr/>
+                      <wps:spPr>
+                        <a:xfrm flipV="1">
+                          <a:off x="0" y="0"/>
+                          <a:ext cx="1945843" cy="0"/>
+                        </a:xfrm>
+                        <a:prstGeom prst="line">
+                          <a:avLst/>
+                        </a:prstGeom>
+                      </wps:spPr>
+                      <wps:style>
+                        <a:lnRef idx="1">
+                          <a:schemeClr val="dk1"/>
+                        </a:lnRef>
+                        <a:fillRef idx="0">
+                          <a:schemeClr val="dk1"/>
+                        </a:fillRef>
+                        <a:effectRef idx="0">
+                          <a:schemeClr val="dk1"/>
+                        </a:effectRef>
+                        <a:fontRef idx="minor">
+                          <a:schemeClr val="tx1"/>
+                        </a:fontRef>
+                      </wps:style>
+                      <wps:bodyPr/>
+                    </wps:wsp>
+                  </a:graphicData>
+                </a:graphic>
+                <wp14:sizeRelH relativeFrom="margin">
+                  <wp14:pctWidth>0</wp14:pctWidth>
+                </wp14:sizeRelH>
+                <wp14:sizeRelV relativeFrom="margin">
+                  <wp14:pctHeight>0</wp14:pctHeight>
+                </wp14:sizeRelV>
+              </wp:anchor>
+            </w:drawing>
+          </mc:Choice>
+          <mc:Fallback>
+            <w:pict>
+              <v:line w14:anchorId="4044202F" id="Straight Connector 3" o:spid="_x0000_s1026" style="position:absolute;flip:y;z-index:251660288;visibility:visible;mso-wrap-style:square;mso-width-percent:0;mso-height-percent:0;mso-wrap-distance-left:9pt;mso-wrap-distance-top:0;mso-wrap-distance-right:9pt;mso-wrap-distance-bottom:0;mso-position-horizontal:absolute;mso-position-horizontal-relative:text;mso-position-vertical:absolute;mso-position-vertical-relative:text;mso-width-percent:0;mso-height-percent:0;mso-width-relative:margin;mso-height-relative:margin" from="309.45pt,12.05pt" to="462.65pt,12.05pt" o:gfxdata="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" strokecolor="black [3200]" strokeweight=".5pt">
+                <v:stroke joinstyle="miter"/>
+              </v:line>
+            </w:pict>
+          </mc:Fallback>
+        </mc:AlternateContent>
+      </w:r>
     </w:p>
     <w:p>
       <w:pPr>
         <w:spacing w:after="0"/>
+        <w:rPr>
+          <w:rFonts w:ascii="Arial" w:hAnsi="Arial" w:cs="Arial"/>
+          <w:sz w:val="24"/>
+          <w:szCs w:val="24"/>
+        </w:rPr>
+      </w:pPr>
+      <w:r>
         <w:rPr>
           <w:rFonts w:ascii="Arial" w:hAnsi="Arial" w:cs="Arial"/>
           <w:b/>
@@ -1059,7 +1139,10 @@
           <w:szCs w:val="24"/>
           <w:u w:val="single"/>
         </w:rPr>
-      </w:pPr>
+        <w:t>{</w:t>
+      </w:r>
+      <w:proofErr w:type="spellStart"/>
+      <w:proofErr w:type="gramStart"/>
       <w:r>
         <w:rPr>
           <w:rFonts w:ascii="Arial" w:hAnsi="Arial" w:cs="Arial"/>
@@ -1068,9 +1151,9 @@
           <w:szCs w:val="24"/>
           <w:u w:val="single"/>
         </w:rPr>
-        <w:t>{</w:t>
-      </w:r>
-      <w:proofErr w:type="spellStart"/>
+        <w:t>ConformeName</w:t>
+      </w:r>
+      <w:proofErr w:type="spellEnd"/>
       <w:r>
         <w:rPr>
           <w:rFonts w:ascii="Arial" w:hAnsi="Arial" w:cs="Arial"/>
@@ -1079,30 +1162,114 @@
           <w:szCs w:val="24"/>
           <w:u w:val="single"/>
         </w:rPr>
-        <w:t>ConformeName</w:t>
-      </w:r>
-      <w:proofErr w:type="spellEnd"/>
-      <w:r>
-        <w:rPr>
-          <w:rFonts w:ascii="Arial" w:hAnsi="Arial" w:cs="Arial"/>
-          <w:b/>
+        <w:t>}</w:t>
+      </w:r>
+      <w:r>
+        <w:rPr>
+          <w:rFonts w:ascii="Arial" w:hAnsi="Arial" w:cs="Arial"/>
+          <w:b/>
+          <w:sz w:val="24"/>
+          <w:szCs w:val="24"/>
+        </w:rPr>
+        <w:t xml:space="preserve">   </w:t>
+      </w:r>
+      <w:proofErr w:type="gramEnd"/>
+      <w:r>
+        <w:rPr>
+          <w:rFonts w:ascii="Arial" w:hAnsi="Arial" w:cs="Arial"/>
+          <w:b/>
+          <w:sz w:val="24"/>
+          <w:szCs w:val="24"/>
+        </w:rPr>
+        <w:t xml:space="preserve">                                                          </w:t>
+      </w:r>
+      <w:r>
+        <w:rPr>
+          <w:rFonts w:ascii="Arial" w:hAnsi="Arial" w:cs="Arial"/>
+          <w:b/>
+          <w:sz w:val="24"/>
+          <w:szCs w:val="24"/>
+        </w:rPr>
+        <w:t xml:space="preserve">  </w:t>
+      </w:r>
+      <w:r>
+        <w:rPr>
+          <w:rFonts w:ascii="Arial" w:hAnsi="Arial" w:cs="Arial"/>
+          <w:sz w:val="24"/>
+          <w:szCs w:val="24"/>
+        </w:rPr>
+        <w:t>Signature over Printed Name</w:t>
+      </w:r>
+    </w:p>
+    <w:p>
+      <w:pPr>
+        <w:spacing w:after="0"/>
+        <w:rPr>
+          <w:rFonts w:ascii="Arial" w:hAnsi="Arial" w:cs="Arial"/>
+          <w:sz w:val="24"/>
+          <w:szCs w:val="24"/>
+        </w:rPr>
+      </w:pPr>
+      <w:r>
+        <w:rPr>
+          <w:rFonts w:ascii="Arial" w:hAnsi="Arial" w:cs="Arial"/>
+          <w:b/>
+          <w:i/>
+          <w:iCs/>
           <w:sz w:val="24"/>
           <w:szCs w:val="24"/>
           <w:u w:val="single"/>
         </w:rPr>
-        <w:t>}</w:t>
-      </w:r>
-    </w:p>
-    <w:p>
-      <w:pPr>
-        <w:spacing w:after="0"/>
-        <w:rPr>
-          <w:rFonts w:ascii="Arial" w:hAnsi="Arial" w:cs="Arial"/>
+        <w:t>{relationship}</w:t>
+      </w:r>
+      <w:r>
+        <w:rPr>
+          <w:rFonts w:ascii="Arial" w:hAnsi="Arial" w:cs="Arial"/>
+          <w:b/>
           <w:sz w:val="24"/>
           <w:szCs w:val="24"/>
         </w:rPr>
-      </w:pPr>
-      <w:r>
+        <w:t xml:space="preserve">                                      </w:t>
+      </w:r>
+      <w:r>
+        <w:rPr>
+          <w:rFonts w:ascii="Arial" w:hAnsi="Arial" w:cs="Arial"/>
+          <w:b/>
+          <w:sz w:val="24"/>
+          <w:szCs w:val="24"/>
+        </w:rPr>
+        <w:t xml:space="preserve">                              </w:t>
+      </w:r>
+      <w:r>
+        <w:rPr>
+          <w:rFonts w:ascii="Arial" w:hAnsi="Arial" w:cs="Arial"/>
+          <w:sz w:val="24"/>
+          <w:szCs w:val="24"/>
+        </w:rPr>
+        <w:t xml:space="preserve">(Representative of the Funeral)                                                                                                                                                                                                                                                                                                                                                                                                                                                                                                                                                                                                                                                                                                                                                                                                                                                                                                                                                                                                                                                                                                                                                                                                                                                                                                                                                                                                                                                                                                                                                                                                                                                                                                                                                                                                                                                                                                                                                                                                                                                                                                                                                                                                                                                                                                                                                                                                                                                                                                                                                                                                                                                                                                                                                                                                                                                                                                                                                                                                                                                                                                                                                                                                                                                                                                                                                                                                                                                                                                                                                                                                                                                                                                                                                                                                                                                                                                                                                                                                                                                                                                                                                                                                                                                                                                                                                                                                                                                                                                                                                                                                                                                                                                                                                                                                                                                                                                                                                                                                                                                                                                                                                                                                                                                                                                                                                                                                                                                                                                                                                                                                                                                                                                                                                                                                                                                                                                                                                                                                                                                                                                                                                                                                                                                                                                                                                                                                                                                                                                                                                                                                                                                                                                                                                                                                                                                                                                                                                                                                                                                                                                                                                                                                                                                                                                                                                                                                                                                                                                                                                                                                                                                                                                                                                                                                                                                                                                                                                                                                                                                                                                                                                                                                                                                                                                                                                                                                                                                                                                                                                                                                                                                                                                                                                                                                                                                                                                                                                                                                                                                                                                                                                                                                                                                                                                                                                                                                                                                                                                                                                                                                                                                                                                                                                                                                                                                                                                                                                                                                                                                                                                                                                                                                                                                                                                                                                                                                                                                                                                                                                                                                                                                                                                                                                                                                                                                                                                                                                                                                                                                                                                                                                                                                                                                                                                                                                                                                                                                                                                                                                                                                                                                                                                                                                                                                                                                                                                                                                                                                                                                                                                                                                                                                                                                                                                                                                                                                                                                                                                                                                                                                                                                                                                                                                                                                                                                                                                                                                                                                                                                                                                                              </w:t>
+      </w:r>
+    </w:p>
+    <w:p>
+      <w:pPr>
+        <w:pStyle w:val="NoSpacing"/>
+        <w:rPr>
+          <w:rFonts w:ascii="Arial" w:hAnsi="Arial" w:cs="Arial"/>
+          <w:sz w:val="24"/>
+          <w:szCs w:val="24"/>
+        </w:rPr>
+      </w:pPr>
+      <w:r>
+        <w:rPr>
+          <w:rFonts w:ascii="Arial" w:hAnsi="Arial" w:cs="Arial"/>
+          <w:sz w:val="24"/>
+          <w:szCs w:val="24"/>
+        </w:rPr>
+        <w:t xml:space="preserve">                                                                                     </w:t>
+      </w:r>
+    </w:p>
+    <w:p>
+      <w:pPr>
+        <w:spacing w:after="0"/>
         <w:rPr>
           <w:rFonts w:ascii="Arial" w:hAnsi="Arial" w:cs="Arial"/>
           <w:b/>
@@ -1110,63 +1277,18 @@
           <w:szCs w:val="24"/>
           <w:u w:val="single"/>
         </w:rPr>
-        <w:t>{relationship}</w:t>
-      </w:r>
-      <w:r>
-        <w:rPr>
-          <w:rFonts w:ascii="Arial" w:hAnsi="Arial" w:cs="Arial"/>
-          <w:b/>
+      </w:pPr>
+    </w:p>
+    <w:p>
+      <w:pPr>
+        <w:spacing w:after="0"/>
+        <w:ind w:left="5760"/>
+        <w:rPr>
+          <w:rFonts w:ascii="Arial" w:hAnsi="Arial" w:cs="Arial"/>
           <w:sz w:val="24"/>
           <w:szCs w:val="24"/>
-          <w:u w:val="single"/>
-        </w:rPr>
-        <w:t xml:space="preserve">                                      </w:t>
-      </w:r>
-    </w:p>
-    <w:p>
-      <w:pPr>
-        <w:spacing w:after="0"/>
-        <w:ind w:left="5760"/>
-        <w:rPr>
-          <w:rFonts w:ascii="Arial" w:hAnsi="Arial" w:cs="Arial"/>
-          <w:sz w:val="24"/>
-          <w:szCs w:val="24"/>
-        </w:rPr>
-      </w:pPr>
-      <w:r>
-        <w:rPr>
-          <w:rFonts w:ascii="Arial" w:hAnsi="Arial" w:cs="Arial"/>
-          <w:sz w:val="24"/>
-          <w:szCs w:val="24"/>
-        </w:rPr>
-        <w:t xml:space="preserve"> Signature over Printed Name</w:t>
-      </w:r>
-    </w:p>
-    <w:p>
-      <w:pPr>
-        <w:pStyle w:val="NoSpacing"/>
-        <w:rPr>
-          <w:rFonts w:ascii="Arial" w:hAnsi="Arial" w:cs="Arial"/>
-          <w:sz w:val="24"/>
-          <w:szCs w:val="24"/>
-        </w:rPr>
-      </w:pPr>
-      <w:r>
-        <w:rPr>
-          <w:rFonts w:ascii="Arial" w:hAnsi="Arial" w:cs="Arial"/>
-          <w:sz w:val="24"/>
-          <w:szCs w:val="24"/>
-        </w:rPr>
-        <w:t xml:space="preserve">                                                                                      </w:t>
-      </w:r>
-      <w:r>
-        <w:rPr>
-          <w:rFonts w:ascii="Arial" w:hAnsi="Arial" w:cs="Arial"/>
-          <w:sz w:val="24"/>
-          <w:szCs w:val="24"/>
-        </w:rPr>
-        <w:t xml:space="preserve">(Representative of the Funeral)                                                                                                                                                                                                                                                                                                                                                                                                                                                                                                                                                                                                                                                                                                                                                                                                                                                                                                                                                                                                                                                                                                                                                                                                                                                                                                                                                                                                                                                                                                                                                                                                                                                                                                                                                                                                                                                                                                                                                                                                                                                                                                                                                                                                                                                                                                                                                                                                                                                                                                                                                                                                                                                                                                                                                                                                                                                                                                                                                                                                                                                                                                                                                                                                                                                                                                                                                                                                                                                                                                                                                                                                                                                                                                                                                                                                                                                                                                                                                                                                                                                                                                                                                                                                                                                                                                                                                                                                                                                                                                                                                                                                                                                                                                                                                                                                                                                                                                                                                                                                                                                                                                                                                                                                                                                                                                                                                                                                                                                                                                                                                                                                                                                                                                                                                                                                                                                                                                                                                                                                                                                                                                                                                                                                                                                                                                                                                                                                                                                                                                                                                                                                                                                                                                                                                                                                                                                                                                                                                                                                                                                                                                                                                                                                                                                                                                                                                                                                                                                                                                                                                                                                                                                                                                                                                                                                                                                                                                                                                                                                                                                                                                                                                                                                                                                                                                                                                                                                                                                                                                                                                                                                                                                                                                                                                                                                                                                                                                                                                                                                                                                                                                                                                                                                                                                                                                                                                                                                                                                                                                                                                                                                                                                                                                                                                                                                                                                                                                                                                                                                                                                                                                                                                                                                                                                                                                                                                                                                                                                                                                                                                                                                                                                                                                                                                                                                                                                                                                                                                                                                                                                                                                                                                                                                                                                                                                                                                                                                                                                                                                                                                                                                                                                                                                                                                                                                                                                                                                                                                                                                                                                                                                                                                                                                                                                                                                                                                                                                                                                                                                                                                                                                                                                                                                                                                                                                                                                                                                                                                                                                                                                                                                                              </w:t>
-      </w:r>
+        </w:rPr>
+      </w:pPr>
     </w:p>
     <w:p>
       <w:pPr>
@@ -1286,7 +1408,7 @@
           <w:sz w:val="10"/>
           <w:szCs w:val="10"/>
         </w:rPr>
-        <w:t xml:space="preserve">   Verification Code:</w:t>
+        <w:t>Verification Code:</w:t>
       </w:r>
       <w:r>
         <w:rPr>
@@ -1343,7 +1465,7 @@
           <w:sz w:val="10"/>
           <w:szCs w:val="10"/>
         </w:rPr>
-        <w:t xml:space="preserve">   Scan the QR code</w:t>
+        <w:t>Scan the QR code</w:t>
       </w:r>
       <w:r>
         <w:rPr>
@@ -1374,7 +1496,7 @@
 </file>
 
 <file path=word/endnotes.xml><?xml version="1.0" encoding="utf-8"?>
-<w:endnotes xmlns:wpc="http://schemas.microsoft.com/office/word/2010/wordprocessingCanvas" xmlns:cx="http://schemas.microsoft.com/office/drawing/2014/chartex" xmlns:cx1="http://schemas.microsoft.com/office/drawing/2015/9/8/chartex" xmlns:cx2="http://schemas.microsoft.com/office/drawing/2015/10/21/chartex" xmlns:cx3="http://schemas.microsoft.com/office/drawing/2016/5/9/chartex" xmlns:cx4="http://schemas.microsoft.com/office/drawing/2016/5/10/chartex" xmlns:cx5="http://schemas.microsoft.com/office/drawing/2016/5/11/chartex" xmlns:cx6="http://schemas.microsoft.com/office/drawing/2016/5/12/chartex" xmlns:cx7="http://schemas.microsoft.com/office/drawing/2016/5/13/chartex" xmlns:cx8="http://schemas.microsoft.com/office/drawing/2016/5/14/chartex" xmlns:mc="http://schemas.openxmlformats.org/markup-compatibility/2006" xmlns:aink="http://schemas.microsoft.com/office/drawing/2016/ink" xmlns:am3d="http://schemas.microsoft.com/office/drawing/2017/model3d" xmlns:o="urn:schemas-microsoft-com:office:office" xmlns:oel="http://schemas.microsoft.com/office/2019/extlst" xmlns:r="http://schemas.openxmlformats.org/officeDocument/2006/relationships" xmlns:m="http://schemas.openxmlformats.org/officeDocument/2006/math" xmlns:v="urn:schemas-microsoft-com:vml" xmlns:wp14="http://schemas.microsoft.com/office/word/2010/wordprocessingDrawing" xmlns:wp="http://schemas.openxmlformats.org/drawingml/2006/wordprocessingDrawing" xmlns:w10="urn:schemas-microsoft-com:office:word" xmlns:w="http://schemas.openxmlformats.org/wordprocessingml/2006/main" xmlns:w14="http://schemas.microsoft.com/office/word/2010/wordml" xmlns:w15="http://schemas.microsoft.com/office/word/2012/wordml" xmlns:w16cex="http://schemas.microsoft.com/office/word/2018/wordml/cex" xmlns:w16cid="http://schemas.microsoft.com/office/word/2016/wordml/cid" xmlns:w16="http://schemas.microsoft.com/office/word/2018/wordml" xmlns:w16du="http://schemas.microsoft.com/office/word/2023/wordml/word16du" xmlns:w16sdtdh="http://schemas.microsoft.com/office/word/2020/wordml/sdtdatahash" xmlns:w16sdtfl="http://schemas.microsoft.com/office/word/2024/wordml/sdtformatlock" xmlns:w16se="http://schemas.microsoft.com/office/word/2015/wordml/symex" xmlns:wpg="http://schemas.microsoft.com/office/word/2010/wordprocessingGroup" xmlns:wpi="http://schemas.microsoft.com/office/word/2010/wordprocessingInk" xmlns:wne="http://schemas.microsoft.com/office/word/2006/wordml" xmlns:wps="http://schemas.microsoft.com/office/word/2010/wordprocessingShape" mc:Ignorable="w14 w15 w16se w16cid w16 w16cex w16sdtdh w16sdtfl w16du wp14">
+<w:endnotes xmlns:wpc="http://schemas.microsoft.com/office/word/2010/wordprocessingCanvas" xmlns:cx="http://schemas.microsoft.com/office/drawing/2014/chartex" xmlns:cx1="http://schemas.microsoft.com/office/drawing/2015/9/8/chartex" xmlns:cx2="http://schemas.microsoft.com/office/drawing/2015/10/21/chartex" xmlns:cx3="http://schemas.microsoft.com/office/drawing/2016/5/9/chartex" xmlns:cx4="http://schemas.microsoft.com/office/drawing/2016/5/10/chartex" xmlns:cx5="http://schemas.microsoft.com/office/drawing/2016/5/11/chartex" xmlns:cx6="http://schemas.microsoft.com/office/drawing/2016/5/12/chartex" xmlns:cx7="http://schemas.microsoft.com/office/drawing/2016/5/13/chartex" xmlns:cx8="http://schemas.microsoft.com/office/drawing/2016/5/14/chartex" xmlns:mc="http://schemas.openxmlformats.org/markup-compatibility/2006" xmlns:aink="http://schemas.microsoft.com/office/drawing/2016/ink" xmlns:am3d="http://schemas.microsoft.com/office/drawing/2017/model3d" xmlns:o="urn:schemas-microsoft-com:office:office" xmlns:oel="http://schemas.microsoft.com/office/2019/extlst" xmlns:r="http://schemas.openxmlformats.org/officeDocument/2006/relationships" xmlns:m="http://schemas.openxmlformats.org/officeDocument/2006/math" xmlns:v="urn:schemas-microsoft-com:vml" xmlns:wp14="http://schemas.microsoft.com/office/word/2010/wordprocessingDrawing" xmlns:wp="http://schemas.openxmlformats.org/drawingml/2006/wordprocessingDrawing" xmlns:w10="urn:schemas-microsoft-com:office:word" xmlns:w="http://schemas.openxmlformats.org/wordprocessingml/2006/main" xmlns:w14="http://schemas.microsoft.com/office/word/2010/wordml" xmlns:w15="http://schemas.microsoft.com/office/word/2012/wordml" xmlns:w16cei="http://schemas.microsoft.com/office/word/2026/wordml/cei" xmlns:w16cex="http://schemas.microsoft.com/office/word/2018/wordml/cex" xmlns:w16cid="http://schemas.microsoft.com/office/word/2016/wordml/cid" xmlns:w16="http://schemas.microsoft.com/office/word/2018/wordml" xmlns:w16du="http://schemas.microsoft.com/office/word/2023/wordml/word16du" xmlns:w16sdtdh="http://schemas.microsoft.com/office/word/2020/wordml/sdtdatahash" xmlns:w16sdtfl="http://schemas.microsoft.com/office/word/2024/wordml/sdtformatlock" xmlns:w16se="http://schemas.microsoft.com/office/word/2015/wordml/symex" xmlns:wpg="http://schemas.microsoft.com/office/word/2010/wordprocessingGroup" xmlns:wpi="http://schemas.microsoft.com/office/word/2010/wordprocessingInk" xmlns:wne="http://schemas.microsoft.com/office/word/2006/wordml" xmlns:wps="http://schemas.microsoft.com/office/word/2010/wordprocessingShape" mc:Ignorable="w14 w15 w16se w16cid w16 w16cex w16sdtdh w16sdtfl w16du wp14">
   <w:endnote w:type="separator" w:id="-1">
     <w:p>
       <w:pPr>
@@ -1399,7 +1521,7 @@
 </file>
 
 <file path=word/footer1.xml><?xml version="1.0" encoding="utf-8"?>
-<w:ftr xmlns:wpc="http://schemas.microsoft.com/office/word/2010/wordprocessingCanvas" xmlns:cx="http://schemas.microsoft.com/office/drawing/2014/chartex" xmlns:cx1="http://schemas.microsoft.com/office/drawing/2015/9/8/chartex" xmlns:cx2="http://schemas.microsoft.com/office/drawing/2015/10/21/chartex" xmlns:cx3="http://schemas.microsoft.com/office/drawing/2016/5/9/chartex" xmlns:cx4="http://schemas.microsoft.com/office/drawing/2016/5/10/chartex" xmlns:cx5="http://schemas.microsoft.com/office/drawing/2016/5/11/chartex" xmlns:cx6="http://schemas.microsoft.com/office/drawing/2016/5/12/chartex" xmlns:cx7="http://schemas.microsoft.com/office/drawing/2016/5/13/chartex" xmlns:cx8="http://schemas.microsoft.com/office/drawing/2016/5/14/chartex" xmlns:mc="http://schemas.openxmlformats.org/markup-compatibility/2006" xmlns:aink="http://schemas.microsoft.com/office/drawing/2016/ink" xmlns:am3d="http://schemas.microsoft.com/office/drawing/2017/model3d" xmlns:o="urn:schemas-microsoft-com:office:office" xmlns:oel="http://schemas.microsoft.com/office/2019/extlst" xmlns:r="http://schemas.openxmlformats.org/officeDocument/2006/relationships" xmlns:m="http://schemas.openxmlformats.org/officeDocument/2006/math" xmlns:v="urn:schemas-microsoft-com:vml" xmlns:wp14="http://schemas.microsoft.com/office/word/2010/wordprocessingDrawing" xmlns:wp="http://schemas.openxmlformats.org/drawingml/2006/wordprocessingDrawing" xmlns:w10="urn:schemas-microsoft-com:office:word" xmlns:w="http://schemas.openxmlformats.org/wordprocessingml/2006/main" xmlns:w14="http://schemas.microsoft.com/office/word/2010/wordml" xmlns:w15="http://schemas.microsoft.com/office/word/2012/wordml" xmlns:w16cex="http://schemas.microsoft.com/office/word/2018/wordml/cex" xmlns:w16cid="http://schemas.microsoft.com/office/word/2016/wordml/cid" xmlns:w16="http://schemas.microsoft.com/office/word/2018/wordml" xmlns:w16du="http://schemas.microsoft.com/office/word/2023/wordml/word16du" xmlns:w16sdtdh="http://schemas.microsoft.com/office/word/2020/wordml/sdtdatahash" xmlns:w16sdtfl="http://schemas.microsoft.com/office/word/2024/wordml/sdtformatlock" xmlns:w16se="http://schemas.microsoft.com/office/word/2015/wordml/symex" xmlns:wpg="http://schemas.microsoft.com/office/word/2010/wordprocessingGroup" xmlns:wpi="http://schemas.microsoft.com/office/word/2010/wordprocessingInk" xmlns:wne="http://schemas.microsoft.com/office/word/2006/wordml" xmlns:wps="http://schemas.microsoft.com/office/word/2010/wordprocessingShape" mc:Ignorable="w14 w15 w16se w16cid w16 w16cex w16sdtdh w16sdtfl w16du wp14">
+<w:ftr xmlns:wpc="http://schemas.microsoft.com/office/word/2010/wordprocessingCanvas" xmlns:cx="http://schemas.microsoft.com/office/drawing/2014/chartex" xmlns:cx1="http://schemas.microsoft.com/office/drawing/2015/9/8/chartex" xmlns:cx2="http://schemas.microsoft.com/office/drawing/2015/10/21/chartex" xmlns:cx3="http://schemas.microsoft.com/office/drawing/2016/5/9/chartex" xmlns:cx4="http://schemas.microsoft.com/office/drawing/2016/5/10/chartex" xmlns:cx5="http://schemas.microsoft.com/office/drawing/2016/5/11/chartex" xmlns:cx6="http://schemas.microsoft.com/office/drawing/2016/5/12/chartex" xmlns:cx7="http://schemas.microsoft.com/office/drawing/2016/5/13/chartex" xmlns:cx8="http://schemas.microsoft.com/office/drawing/2016/5/14/chartex" xmlns:mc="http://schemas.openxmlformats.org/markup-compatibility/2006" xmlns:aink="http://schemas.microsoft.com/office/drawing/2016/ink" xmlns:am3d="http://schemas.microsoft.com/office/drawing/2017/model3d" xmlns:o="urn:schemas-microsoft-com:office:office" xmlns:oel="http://schemas.microsoft.com/office/2019/extlst" xmlns:r="http://schemas.openxmlformats.org/officeDocument/2006/relationships" xmlns:m="http://schemas.openxmlformats.org/officeDocument/2006/math" xmlns:v="urn:schemas-microsoft-com:vml" xmlns:wp14="http://schemas.microsoft.com/office/word/2010/wordprocessingDrawing" xmlns:wp="http://schemas.openxmlformats.org/drawingml/2006/wordprocessingDrawing" xmlns:w10="urn:schemas-microsoft-com:office:word" xmlns:w="http://schemas.openxmlformats.org/wordprocessingml/2006/main" xmlns:w14="http://schemas.microsoft.com/office/word/2010/wordml" xmlns:w15="http://schemas.microsoft.com/office/word/2012/wordml" xmlns:w16cei="http://schemas.microsoft.com/office/word/2026/wordml/cei" xmlns:w16cex="http://schemas.microsoft.com/office/word/2018/wordml/cex" xmlns:w16cid="http://schemas.microsoft.com/office/word/2016/wordml/cid" xmlns:w16="http://schemas.microsoft.com/office/word/2018/wordml" xmlns:w16du="http://schemas.microsoft.com/office/word/2023/wordml/word16du" xmlns:w16sdtdh="http://schemas.microsoft.com/office/word/2020/wordml/sdtdatahash" xmlns:w16sdtfl="http://schemas.microsoft.com/office/word/2024/wordml/sdtformatlock" xmlns:w16se="http://schemas.microsoft.com/office/word/2015/wordml/symex" xmlns:wpg="http://schemas.microsoft.com/office/word/2010/wordprocessingGroup" xmlns:wpi="http://schemas.microsoft.com/office/word/2010/wordprocessingInk" xmlns:wne="http://schemas.microsoft.com/office/word/2006/wordml" xmlns:wps="http://schemas.microsoft.com/office/word/2010/wordprocessingShape" mc:Ignorable="w14 w15 w16se w16cid w16 w16cex w16sdtdh w16sdtfl w16du wp14">
   <w:p>
     <w:pPr>
       <w:tabs>
@@ -1616,7 +1738,7 @@
 </file>
 
 <file path=word/footnotes.xml><?xml version="1.0" encoding="utf-8"?>
-<w:footnotes xmlns:wpc="http://schemas.microsoft.com/office/word/2010/wordprocessingCanvas" xmlns:cx="http://schemas.microsoft.com/office/drawing/2014/chartex" xmlns:cx1="http://schemas.microsoft.com/office/drawing/2015/9/8/chartex" xmlns:cx2="http://schemas.microsoft.com/office/drawing/2015/10/21/chartex" xmlns:cx3="http://schemas.microsoft.com/office/drawing/2016/5/9/chartex" xmlns:cx4="http://schemas.microsoft.com/office/drawing/2016/5/10/chartex" xmlns:cx5="http://schemas.microsoft.com/office/drawing/2016/5/11/chartex" xmlns:cx6="http://schemas.microsoft.com/office/drawing/2016/5/12/chartex" xmlns:cx7="http://schemas.microsoft.com/office/drawing/2016/5/13/chartex" xmlns:cx8="http://schemas.microsoft.com/office/drawing/2016/5/14/chartex" xmlns:mc="http://schemas.openxmlformats.org/markup-compatibility/2006" xmlns:aink="http://schemas.microsoft.com/office/drawing/2016/ink" xmlns:am3d="http://schemas.microsoft.com/office/drawing/2017/model3d" xmlns:o="urn:schemas-microsoft-com:office:office" xmlns:oel="http://schemas.microsoft.com/office/2019/extlst" xmlns:r="http://schemas.openxmlformats.org/officeDocument/2006/relationships" xmlns:m="http://schemas.openxmlformats.org/officeDocument/2006/math" xmlns:v="urn:schemas-microsoft-com:vml" xmlns:wp14="http://schemas.microsoft.com/office/word/2010/wordprocessingDrawing" xmlns:wp="http://schemas.openxmlformats.org/drawingml/2006/wordprocessingDrawing" xmlns:w10="urn:schemas-microsoft-com:office:word" xmlns:w="http://schemas.openxmlformats.org/wordprocessingml/2006/main" xmlns:w14="http://schemas.microsoft.com/office/word/2010/wordml" xmlns:w15="http://schemas.microsoft.com/office/word/2012/wordml" xmlns:w16cex="http://schemas.microsoft.com/office/word/2018/wordml/cex" xmlns:w16cid="http://schemas.microsoft.com/office/word/2016/wordml/cid" xmlns:w16="http://schemas.microsoft.com/office/word/2018/wordml" xmlns:w16du="http://schemas.microsoft.com/office/word/2023/wordml/word16du" xmlns:w16sdtdh="http://schemas.microsoft.com/office/word/2020/wordml/sdtdatahash" xmlns:w16sdtfl="http://schemas.microsoft.com/office/word/2024/wordml/sdtformatlock" xmlns:w16se="http://schemas.microsoft.com/office/word/2015/wordml/symex" xmlns:wpg="http://schemas.microsoft.com/office/word/2010/wordprocessingGroup" xmlns:wpi="http://schemas.microsoft.com/office/word/2010/wordprocessingInk" xmlns:wne="http://schemas.microsoft.com/office/word/2006/wordml" xmlns:wps="http://schemas.microsoft.com/office/word/2010/wordprocessingShape" mc:Ignorable="w14 w15 w16se w16cid w16 w16cex w16sdtdh w16sdtfl w16du wp14">
+<w:footnotes xmlns:wpc="http://schemas.microsoft.com/office/word/2010/wordprocessingCanvas" xmlns:cx="http://schemas.microsoft.com/office/drawing/2014/chartex" xmlns:cx1="http://schemas.microsoft.com/office/drawing/2015/9/8/chartex" xmlns:cx2="http://schemas.microsoft.com/office/drawing/2015/10/21/chartex" xmlns:cx3="http://schemas.microsoft.com/office/drawing/2016/5/9/chartex" xmlns:cx4="http://schemas.microsoft.com/office/drawing/2016/5/10/chartex" xmlns:cx5="http://schemas.microsoft.com/office/drawing/2016/5/11/chartex" xmlns:cx6="http://schemas.microsoft.com/office/drawing/2016/5/12/chartex" xmlns:cx7="http://schemas.microsoft.com/office/drawing/2016/5/13/chartex" xmlns:cx8="http://schemas.microsoft.com/office/drawing/2016/5/14/chartex" xmlns:mc="http://schemas.openxmlformats.org/markup-compatibility/2006" xmlns:aink="http://schemas.microsoft.com/office/drawing/2016/ink" xmlns:am3d="http://schemas.microsoft.com/office/drawing/2017/model3d" xmlns:o="urn:schemas-microsoft-com:office:office" xmlns:oel="http://schemas.microsoft.com/office/2019/extlst" xmlns:r="http://schemas.openxmlformats.org/officeDocument/2006/relationships" xmlns:m="http://schemas.openxmlformats.org/officeDocument/2006/math" xmlns:v="urn:schemas-microsoft-com:vml" xmlns:wp14="http://schemas.microsoft.com/office/word/2010/wordprocessingDrawing" xmlns:wp="http://schemas.openxmlformats.org/drawingml/2006/wordprocessingDrawing" xmlns:w10="urn:schemas-microsoft-com:office:word" xmlns:w="http://schemas.openxmlformats.org/wordprocessingml/2006/main" xmlns:w14="http://schemas.microsoft.com/office/word/2010/wordml" xmlns:w15="http://schemas.microsoft.com/office/word/2012/wordml" xmlns:w16cei="http://schemas.microsoft.com/office/word/2026/wordml/cei" xmlns:w16cex="http://schemas.microsoft.com/office/word/2018/wordml/cex" xmlns:w16cid="http://schemas.microsoft.com/office/word/2016/wordml/cid" xmlns:w16="http://schemas.microsoft.com/office/word/2018/wordml" xmlns:w16du="http://schemas.microsoft.com/office/word/2023/wordml/word16du" xmlns:w16sdtdh="http://schemas.microsoft.com/office/word/2020/wordml/sdtdatahash" xmlns:w16sdtfl="http://schemas.microsoft.com/office/word/2024/wordml/sdtformatlock" xmlns:w16se="http://schemas.microsoft.com/office/word/2015/wordml/symex" xmlns:wpg="http://schemas.microsoft.com/office/word/2010/wordprocessingGroup" xmlns:wpi="http://schemas.microsoft.com/office/word/2010/wordprocessingInk" xmlns:wne="http://schemas.microsoft.com/office/word/2006/wordml" xmlns:wps="http://schemas.microsoft.com/office/word/2010/wordprocessingShape" mc:Ignorable="w14 w15 w16se w16cid w16 w16cex w16sdtdh w16sdtfl w16du wp14">
   <w:footnote w:type="separator" w:id="-1">
     <w:p>
       <w:pPr>
@@ -1641,7 +1763,7 @@
 </file>
 
 <file path=word/header1.xml><?xml version="1.0" encoding="utf-8"?>
-<w:hdr xmlns:wpc="http://schemas.microsoft.com/office/word/2010/wordprocessingCanvas" xmlns:cx="http://schemas.microsoft.com/office/drawing/2014/chartex" xmlns:cx1="http://schemas.microsoft.com/office/drawing/2015/9/8/chartex" xmlns:cx2="http://schemas.microsoft.com/office/drawing/2015/10/21/chartex" xmlns:cx3="http://schemas.microsoft.com/office/drawing/2016/5/9/chartex" xmlns:cx4="http://schemas.microsoft.com/office/drawing/2016/5/10/chartex" xmlns:cx5="http://schemas.microsoft.com/office/drawing/2016/5/11/chartex" xmlns:cx6="http://schemas.microsoft.com/office/drawing/2016/5/12/chartex" xmlns:cx7="http://schemas.microsoft.com/office/drawing/2016/5/13/chartex" xmlns:cx8="http://schemas.microsoft.com/office/drawing/2016/5/14/chartex" xmlns:mc="http://schemas.openxmlformats.org/markup-compatibility/2006" xmlns:aink="http://schemas.microsoft.com/office/drawing/2016/ink" xmlns:am3d="http://schemas.microsoft.com/office/drawing/2017/model3d" xmlns:o="urn:schemas-microsoft-com:office:office" xmlns:oel="http://schemas.microsoft.com/office/2019/extlst" xmlns:r="http://schemas.openxmlformats.org/officeDocument/2006/relationships" xmlns:m="http://schemas.openxmlformats.org/officeDocument/2006/math" xmlns:v="urn:schemas-microsoft-com:vml" xmlns:wp14="http://schemas.microsoft.com/office/word/2010/wordprocessingDrawing" xmlns:wp="http://schemas.openxmlformats.org/drawingml/2006/wordprocessingDrawing" xmlns:w10="urn:schemas-microsoft-com:office:word" xmlns:w="http://schemas.openxmlformats.org/wordprocessingml/2006/main" xmlns:w14="http://schemas.microsoft.com/office/word/2010/wordml" xmlns:w15="http://schemas.microsoft.com/office/word/2012/wordml" xmlns:w16cex="http://schemas.microsoft.com/office/word/2018/wordml/cex" xmlns:w16cid="http://schemas.microsoft.com/office/word/2016/wordml/cid" xmlns:w16="http://schemas.microsoft.com/office/word/2018/wordml" xmlns:w16du="http://schemas.microsoft.com/office/word/2023/wordml/word16du" xmlns:w16sdtdh="http://schemas.microsoft.com/office/word/2020/wordml/sdtdatahash" xmlns:w16sdtfl="http://schemas.microsoft.com/office/word/2024/wordml/sdtformatlock" xmlns:w16se="http://schemas.microsoft.com/office/word/2015/wordml/symex" xmlns:wpg="http://schemas.microsoft.com/office/word/2010/wordprocessingGroup" xmlns:wpi="http://schemas.microsoft.com/office/word/2010/wordprocessingInk" xmlns:wne="http://schemas.microsoft.com/office/word/2006/wordml" xmlns:wps="http://schemas.microsoft.com/office/word/2010/wordprocessingShape" mc:Ignorable="w14 w15 w16se w16cid w16 w16cex w16sdtdh w16sdtfl w16du wp14">
+<w:hdr xmlns:wpc="http://schemas.microsoft.com/office/word/2010/wordprocessingCanvas" xmlns:cx="http://schemas.microsoft.com/office/drawing/2014/chartex" xmlns:cx1="http://schemas.microsoft.com/office/drawing/2015/9/8/chartex" xmlns:cx2="http://schemas.microsoft.com/office/drawing/2015/10/21/chartex" xmlns:cx3="http://schemas.microsoft.com/office/drawing/2016/5/9/chartex" xmlns:cx4="http://schemas.microsoft.com/office/drawing/2016/5/10/chartex" xmlns:cx5="http://schemas.microsoft.com/office/drawing/2016/5/11/chartex" xmlns:cx6="http://schemas.microsoft.com/office/drawing/2016/5/12/chartex" xmlns:cx7="http://schemas.microsoft.com/office/drawing/2016/5/13/chartex" xmlns:cx8="http://schemas.microsoft.com/office/drawing/2016/5/14/chartex" xmlns:mc="http://schemas.openxmlformats.org/markup-compatibility/2006" xmlns:aink="http://schemas.microsoft.com/office/drawing/2016/ink" xmlns:am3d="http://schemas.microsoft.com/office/drawing/2017/model3d" xmlns:o="urn:schemas-microsoft-com:office:office" xmlns:oel="http://schemas.microsoft.com/office/2019/extlst" xmlns:r="http://schemas.openxmlformats.org/officeDocument/2006/relationships" xmlns:m="http://schemas.openxmlformats.org/officeDocument/2006/math" xmlns:v="urn:schemas-microsoft-com:vml" xmlns:wp14="http://schemas.microsoft.com/office/word/2010/wordprocessingDrawing" xmlns:wp="http://schemas.openxmlformats.org/drawingml/2006/wordprocessingDrawing" xmlns:w10="urn:schemas-microsoft-com:office:word" xmlns:w="http://schemas.openxmlformats.org/wordprocessingml/2006/main" xmlns:w14="http://schemas.microsoft.com/office/word/2010/wordml" xmlns:w15="http://schemas.microsoft.com/office/word/2012/wordml" xmlns:w16cei="http://schemas.microsoft.com/office/word/2026/wordml/cei" xmlns:w16cex="http://schemas.microsoft.com/office/word/2018/wordml/cex" xmlns:w16cid="http://schemas.microsoft.com/office/word/2016/wordml/cid" xmlns:w16="http://schemas.microsoft.com/office/word/2018/wordml" xmlns:w16du="http://schemas.microsoft.com/office/word/2023/wordml/word16du" xmlns:w16sdtdh="http://schemas.microsoft.com/office/word/2020/wordml/sdtdatahash" xmlns:w16sdtfl="http://schemas.microsoft.com/office/word/2024/wordml/sdtformatlock" xmlns:w16se="http://schemas.microsoft.com/office/word/2015/wordml/symex" xmlns:wpg="http://schemas.microsoft.com/office/word/2010/wordprocessingGroup" xmlns:wpi="http://schemas.microsoft.com/office/word/2010/wordprocessingInk" xmlns:wne="http://schemas.microsoft.com/office/word/2006/wordml" xmlns:wps="http://schemas.microsoft.com/office/word/2010/wordprocessingShape" mc:Ignorable="w14 w15 w16se w16cid w16 w16cex w16sdtdh w16sdtfl w16du wp14">
   <w:p>
     <w:pPr>
       <w:pStyle w:val="Header"/>
@@ -1723,7 +1845,7 @@
 </file>
 
 <file path=word/numbering.xml><?xml version="1.0" encoding="utf-8"?>
-<w:numbering xmlns:wpc="http://schemas.microsoft.com/office/word/2010/wordprocessingCanvas" xmlns:cx="http://schemas.microsoft.com/office/drawing/2014/chartex" xmlns:cx1="http://schemas.microsoft.com/office/drawing/2015/9/8/chartex" xmlns:cx2="http://schemas.microsoft.com/office/drawing/2015/10/21/chartex" xmlns:cx3="http://schemas.microsoft.com/office/drawing/2016/5/9/chartex" xmlns:cx4="http://schemas.microsoft.com/office/drawing/2016/5/10/chartex" xmlns:cx5="http://schemas.microsoft.com/office/drawing/2016/5/11/chartex" xmlns:cx6="http://schemas.microsoft.com/office/drawing/2016/5/12/chartex" xmlns:cx7="http://schemas.microsoft.com/office/drawing/2016/5/13/chartex" xmlns:cx8="http://schemas.microsoft.com/office/drawing/2016/5/14/chartex" xmlns:mc="http://schemas.openxmlformats.org/markup-compatibility/2006" xmlns:aink="http://schemas.microsoft.com/office/drawing/2016/ink" xmlns:am3d="http://schemas.microsoft.com/office/drawing/2017/model3d" xmlns:o="urn:schemas-microsoft-com:office:office" xmlns:oel="http://schemas.microsoft.com/office/2019/extlst" xmlns:r="http://schemas.openxmlformats.org/officeDocument/2006/relationships" xmlns:m="http://schemas.openxmlformats.org/officeDocument/2006/math" xmlns:v="urn:schemas-microsoft-com:vml" xmlns:wp14="http://schemas.microsoft.com/office/word/2010/wordprocessingDrawing" xmlns:wp="http://schemas.openxmlformats.org/drawingml/2006/wordprocessingDrawing" xmlns:w10="urn:schemas-microsoft-com:office:word" xmlns:w="http://schemas.openxmlformats.org/wordprocessingml/2006/main" xmlns:w14="http://schemas.microsoft.com/office/word/2010/wordml" xmlns:w15="http://schemas.microsoft.com/office/word/2012/wordml" xmlns:w16cex="http://schemas.microsoft.com/office/word/2018/wordml/cex" xmlns:w16cid="http://schemas.microsoft.com/office/word/2016/wordml/cid" xmlns:w16="http://schemas.microsoft.com/office/word/2018/wordml" xmlns:w16du="http://schemas.microsoft.com/office/word/2023/wordml/word16du" xmlns:w16sdtdh="http://schemas.microsoft.com/office/word/2020/wordml/sdtdatahash" xmlns:w16sdtfl="http://schemas.microsoft.com/office/word/2024/wordml/sdtformatlock" xmlns:w16se="http://schemas.microsoft.com/office/word/2015/wordml/symex" xmlns:wpg="http://schemas.microsoft.com/office/word/2010/wordprocessingGroup" xmlns:wpi="http://schemas.microsoft.com/office/word/2010/wordprocessingInk" xmlns:wne="http://schemas.microsoft.com/office/word/2006/wordml" xmlns:wps="http://schemas.microsoft.com/office/word/2010/wordprocessingShape" mc:Ignorable="w14 w15 w16se w16cid w16 w16cex w16sdtdh w16sdtfl w16du wp14">
+<w:numbering xmlns:wpc="http://schemas.microsoft.com/office/word/2010/wordprocessingCanvas" xmlns:cx="http://schemas.microsoft.com/office/drawing/2014/chartex" xmlns:cx1="http://schemas.microsoft.com/office/drawing/2015/9/8/chartex" xmlns:cx2="http://schemas.microsoft.com/office/drawing/2015/10/21/chartex" xmlns:cx3="http://schemas.microsoft.com/office/drawing/2016/5/9/chartex" xmlns:cx4="http://schemas.microsoft.com/office/drawing/2016/5/10/chartex" xmlns:cx5="http://schemas.microsoft.com/office/drawing/2016/5/11/chartex" xmlns:cx6="http://schemas.microsoft.com/office/drawing/2016/5/12/chartex" xmlns:cx7="http://schemas.microsoft.com/office/drawing/2016/5/13/chartex" xmlns:cx8="http://schemas.microsoft.com/office/drawing/2016/5/14/chartex" xmlns:mc="http://schemas.openxmlformats.org/markup-compatibility/2006" xmlns:aink="http://schemas.microsoft.com/office/drawing/2016/ink" xmlns:am3d="http://schemas.microsoft.com/office/drawing/2017/model3d" xmlns:o="urn:schemas-microsoft-com:office:office" xmlns:oel="http://schemas.microsoft.com/office/2019/extlst" xmlns:r="http://schemas.openxmlformats.org/officeDocument/2006/relationships" xmlns:m="http://schemas.openxmlformats.org/officeDocument/2006/math" xmlns:v="urn:schemas-microsoft-com:vml" xmlns:wp14="http://schemas.microsoft.com/office/word/2010/wordprocessingDrawing" xmlns:wp="http://schemas.openxmlformats.org/drawingml/2006/wordprocessingDrawing" xmlns:w10="urn:schemas-microsoft-com:office:word" xmlns:w="http://schemas.openxmlformats.org/wordprocessingml/2006/main" xmlns:w14="http://schemas.microsoft.com/office/word/2010/wordml" xmlns:w15="http://schemas.microsoft.com/office/word/2012/wordml" xmlns:w16cei="http://schemas.microsoft.com/office/word/2026/wordml/cei" xmlns:w16cex="http://schemas.microsoft.com/office/word/2018/wordml/cex" xmlns:w16cid="http://schemas.microsoft.com/office/word/2016/wordml/cid" xmlns:w16="http://schemas.microsoft.com/office/word/2018/wordml" xmlns:w16du="http://schemas.microsoft.com/office/word/2023/wordml/word16du" xmlns:w16sdtdh="http://schemas.microsoft.com/office/word/2020/wordml/sdtdatahash" xmlns:w16sdtfl="http://schemas.microsoft.com/office/word/2024/wordml/sdtformatlock" xmlns:w16se="http://schemas.microsoft.com/office/word/2015/wordml/symex" xmlns:wpg="http://schemas.microsoft.com/office/word/2010/wordprocessingGroup" xmlns:wpi="http://schemas.microsoft.com/office/word/2010/wordprocessingInk" xmlns:wne="http://schemas.microsoft.com/office/word/2006/wordml" xmlns:wps="http://schemas.microsoft.com/office/word/2010/wordprocessingShape" mc:Ignorable="w14 w15 w16se w16cid w16 w16cex w16sdtdh w16sdtfl w16du wp14">
   <w:abstractNum w:abstractNumId="0" w15:restartNumberingAfterBreak="0">
     <w:nsid w:val="221B2FF2"/>
     <w:multiLevelType w:val="hybridMultilevel"/>

</xml_diff>